<commit_message>
Refine portfolio stories, prototypes, résumé, and project tiles
</commit_message>
<xml_diff>
--- a/resume/exports/public-portfolio/resume.docx
+++ b/resume/exports/public-portfolio/resume.docx
@@ -117,15 +117,15 @@
         <w:pStyle w:val="Bullet"/>
       </w:pPr>
       <w:r>
-        <w:t xml:space="preserve">• Led monetization and growth design initiatives for the employer experience, contributing directly to revenue expansion.</w:t>
-      </w:r>
-    </w:p>
-    <w:p>
-      <w:pPr>
-        <w:pStyle w:val="Bullet"/>
-      </w:pPr>
-      <w:r>
-        <w:t xml:space="preserve">• Generated new revenue streams and cost savings by designing and analyzing over 30 A/B tests for employer monetization initiatives.</w:t>
+        <w:t xml:space="preserve">• Designed Job Refresh, owning information architecture, interaction design, messaging, prototypes, and stakeholder alignment; it became part of Sponsored Jobs after six months of free availability.</w:t>
+      </w:r>
+    </w:p>
+    <w:p>
+      <w:pPr>
+        <w:pStyle w:val="Bullet"/>
+      </w:pPr>
+      <w:r>
+        <w:t xml:space="preserve">• Addressed employers’ closing-and-reposting workaround with a flow requiring substantially updated job information; employers reported less time and effort than reposting.</w:t>
       </w:r>
     </w:p>
     <w:p>
@@ -144,117 +144,117 @@
         <w:rPr>
           <w:b/>
         </w:rPr>
+        <w:t xml:space="preserve">Senior Product Designer II</w:t>
+      </w:r>
+      <w:r>
+        <w:t xml:space="preserve">, Redfin</w:t>
+      </w:r>
+    </w:p>
+    <w:p>
+      <w:r>
+        <w:rPr>
+          <w:i/>
+        </w:rPr>
+        <w:t xml:space="preserve">Feb 2022 – Sep 2022 · Remote</w:t>
+      </w:r>
+    </w:p>
+    <w:p>
+      <w:pPr>
+        <w:pStyle w:val="Bullet"/>
+      </w:pPr>
+      <w:r>
+        <w:t xml:space="preserve">• Influenced product roadmap and strategy by delivering user research that realigned business priorities toward customer-first features.</w:t>
+      </w:r>
+    </w:p>
+    <w:p>
+      <w:pPr>
+        <w:pStyle w:val="Bullet"/>
+      </w:pPr>
+      <w:r>
+        <w:t xml:space="preserve">• Conducted discovery and tactical research to identify user needs and business opportunities.</w:t>
+      </w:r>
+    </w:p>
+    <w:p>
+      <w:pPr>
+        <w:pStyle w:val="Bullet"/>
+      </w:pPr>
+      <w:r>
+        <w:t xml:space="preserve">• Supported hiring, onboarding, and growth of design team talent.</w:t>
+      </w:r>
+    </w:p>
+    <w:p>
+      <w:pPr>
+        <w:pStyle w:val="RoleHeading"/>
+      </w:pPr>
+      <w:r>
+        <w:rPr>
+          <w:b/>
+        </w:rPr>
+        <w:t xml:space="preserve">Staff UX Designer</w:t>
+      </w:r>
+      <w:r>
+        <w:t xml:space="preserve">, The Home Depot</w:t>
+      </w:r>
+    </w:p>
+    <w:p>
+      <w:r>
+        <w:rPr>
+          <w:i/>
+        </w:rPr>
+        <w:t xml:space="preserve">Oct 2018 – Feb 2022 · Atlanta, GA</w:t>
+      </w:r>
+    </w:p>
+    <w:p>
+      <w:pPr>
+        <w:pStyle w:val="Bullet"/>
+      </w:pPr>
+      <w:r>
+        <w:t xml:space="preserve">• For a 60-day curbside pickup pilot in 50 stores, about 90% of customers said the order arrived when they expected it, door-to-door time averaged 3.8 minutes with ETAs versus 4.5 without, and calls to change fulfillment fell from a 30%+ baseline to under 10%.</w:t>
+      </w:r>
+    </w:p>
+    <w:p>
+      <w:pPr>
+        <w:pStyle w:val="Bullet"/>
+      </w:pPr>
+      <w:r>
+        <w:t xml:space="preserve">• After a 50-store pilot, price adjustments rolled out to all stores. At 30, 60, and 90 days, order transaction times decreased, associates reported feeling more empowered to help customers, shrink decreased, and SOP adoption for price adjustments increased.</w:t>
+      </w:r>
+    </w:p>
+    <w:p>
+      <w:pPr>
+        <w:pStyle w:val="Bullet"/>
+      </w:pPr>
+      <w:r>
+        <w:t xml:space="preserve">• Designed enterprise tools for merchandising, store systems, and HR with cross-functional product and engineering teams.</w:t>
+      </w:r>
+    </w:p>
+    <w:p>
+      <w:pPr>
+        <w:pStyle w:val="Bullet"/>
+      </w:pPr>
+      <w:r>
+        <w:t xml:space="preserve">• Planned and facilitated research to inform product priorities and validate design decisions.</w:t>
+      </w:r>
+    </w:p>
+    <w:p>
+      <w:pPr>
+        <w:pStyle w:val="Bullet"/>
+      </w:pPr>
+      <w:r>
+        <w:t xml:space="preserve">• Championed accessibility in associate tools and led workshops for designers, product owners, and engineers.</w:t>
+      </w:r>
+    </w:p>
+    <w:p>
+      <w:pPr>
+        <w:pStyle w:val="RoleHeading"/>
+      </w:pPr>
+      <w:r>
+        <w:rPr>
+          <w:b/>
+        </w:rPr>
         <w:t xml:space="preserve">Senior Product Designer</w:t>
       </w:r>
       <w:r>
-        <w:t xml:space="preserve">, Redfin</w:t>
-      </w:r>
-    </w:p>
-    <w:p>
-      <w:r>
-        <w:rPr>
-          <w:i/>
-        </w:rPr>
-        <w:t xml:space="preserve">Feb 2022 – Sep 2022 · Remote</w:t>
-      </w:r>
-    </w:p>
-    <w:p>
-      <w:pPr>
-        <w:pStyle w:val="Bullet"/>
-      </w:pPr>
-      <w:r>
-        <w:t xml:space="preserve">• Influenced product roadmap and strategy by delivering user research that realigned business priorities toward customer-first features.</w:t>
-      </w:r>
-    </w:p>
-    <w:p>
-      <w:pPr>
-        <w:pStyle w:val="Bullet"/>
-      </w:pPr>
-      <w:r>
-        <w:t xml:space="preserve">• Conducted discovery and tactical research to identify user needs and business opportunities.</w:t>
-      </w:r>
-    </w:p>
-    <w:p>
-      <w:pPr>
-        <w:pStyle w:val="Bullet"/>
-      </w:pPr>
-      <w:r>
-        <w:t xml:space="preserve">• Supported hiring, onboarding, and growth of design team talent.</w:t>
-      </w:r>
-    </w:p>
-    <w:p>
-      <w:pPr>
-        <w:pStyle w:val="RoleHeading"/>
-      </w:pPr>
-      <w:r>
-        <w:rPr>
-          <w:b/>
-        </w:rPr>
-        <w:t xml:space="preserve">Staff UX Designer</w:t>
-      </w:r>
-      <w:r>
-        <w:t xml:space="preserve">, The Home Depot</w:t>
-      </w:r>
-    </w:p>
-    <w:p>
-      <w:r>
-        <w:rPr>
-          <w:i/>
-        </w:rPr>
-        <w:t xml:space="preserve">Oct 2018 – Feb 2022 · Atlanta, GA</w:t>
-      </w:r>
-    </w:p>
-    <w:p>
-      <w:pPr>
-        <w:pStyle w:val="Bullet"/>
-      </w:pPr>
-      <w:r>
-        <w:t xml:space="preserve">• For a 60-day curbside pickup pilot in 50 stores, about 90% of customers said the order arrived when they expected it, door-to-door time averaged 3.8 minutes with ETAs versus 4.5 without, and calls to change fulfillment fell from a 30%+ baseline to under 10%.</w:t>
-      </w:r>
-    </w:p>
-    <w:p>
-      <w:pPr>
-        <w:pStyle w:val="Bullet"/>
-      </w:pPr>
-      <w:r>
-        <w:t xml:space="preserve">• After a 50-store pilot, price adjustments rolled out to all stores. At 30, 60, and 90 days, order transaction times decreased, associates reported feeling more empowered to help customers, shrink decreased, and SOP adoption for price adjustments increased.</w:t>
-      </w:r>
-    </w:p>
-    <w:p>
-      <w:pPr>
-        <w:pStyle w:val="Bullet"/>
-      </w:pPr>
-      <w:r>
-        <w:t xml:space="preserve">• Designed enterprise tools for merchandising, store systems, and HR with cross-functional product and engineering teams.</w:t>
-      </w:r>
-    </w:p>
-    <w:p>
-      <w:pPr>
-        <w:pStyle w:val="Bullet"/>
-      </w:pPr>
-      <w:r>
-        <w:t xml:space="preserve">• Planned and facilitated research to inform product priorities and validate design decisions.</w:t>
-      </w:r>
-    </w:p>
-    <w:p>
-      <w:pPr>
-        <w:pStyle w:val="Bullet"/>
-      </w:pPr>
-      <w:r>
-        <w:t xml:space="preserve">• Championed accessibility in associate tools and led workshops for designers, product owners, and engineers.</w:t>
-      </w:r>
-    </w:p>
-    <w:p>
-      <w:pPr>
-        <w:pStyle w:val="RoleHeading"/>
-      </w:pPr>
-      <w:r>
-        <w:rPr>
-          <w:b/>
-        </w:rPr>
-        <w:t xml:space="preserve">Senior Product Designer</w:t>
-      </w:r>
-      <w:r>
         <w:t xml:space="preserve">, Snap! Mobile</w:t>
       </w:r>
     </w:p>
@@ -282,7 +282,7 @@
         <w:rPr>
           <w:b/>
         </w:rPr>
-        <w:t xml:space="preserve">UX Designer</w:t>
+        <w:t xml:space="preserve">UX Designer II</w:t>
       </w:r>
       <w:r>
         <w:t xml:space="preserve">, Amazon</w:t>
@@ -339,7 +339,7 @@
         <w:pStyle w:val="Bullet"/>
       </w:pPr>
       <w:r>
-        <w:t xml:space="preserve">• Managed and supported a team of four designers and a UX researcher.</w:t>
+        <w:t xml:space="preserve">• Contributed to the Grommet design system, enhancing accessibility and reusability across HP products.</w:t>
       </w:r>
     </w:p>
     <w:p>
@@ -382,7 +382,7 @@
     </w:p>
     <w:p>
       <w:r>
-        <w:t xml:space="preserve">FullSail University — Winter Park, FL · 2008</w:t>
+        <w:t xml:space="preserve">Full Sail University — Winter Park, FL · 2009</w:t>
       </w:r>
     </w:p>
     <w:p>

</xml_diff>